<commit_message>
files and folder till 07-09-26
</commit_message>
<xml_diff>
--- a/Documentation/006CP2744_day32.docx
+++ b/Documentation/006CP2744_day32.docx
@@ -1199,6 +1199,7 @@
         <w:rPr>
           <w:b/>
           <w:bCs/>
+          <w:noProof/>
           <w:lang w:val="en-US"/>
         </w:rPr>
         <w:drawing>
@@ -1403,6 +1404,7 @@
         <w:rPr>
           <w:b/>
           <w:bCs/>
+          <w:noProof/>
         </w:rPr>
         <w:drawing>
           <wp:inline distT="0" distB="0" distL="0" distR="0" wp14:anchorId="098E31D5" wp14:editId="272B797E">
@@ -2197,6 +2199,7 @@
         <w:rPr>
           <w:b/>
           <w:bCs/>
+          <w:noProof/>
         </w:rPr>
         <w:drawing>
           <wp:inline distT="0" distB="0" distL="0" distR="0" wp14:anchorId="3AEBBCF0" wp14:editId="454509C3">
@@ -2941,6 +2944,7 @@
         <w:rPr>
           <w:b/>
           <w:bCs/>
+          <w:noProof/>
           <w:lang w:val="en-US"/>
         </w:rPr>
         <w:drawing>
@@ -3049,6 +3053,7 @@
         <w:rPr>
           <w:b/>
           <w:bCs/>
+          <w:noProof/>
           <w:lang w:val="en-US"/>
         </w:rPr>
         <w:drawing>
@@ -3453,6 +3458,7 @@
         <w:rPr>
           <w:b/>
           <w:bCs/>
+          <w:noProof/>
           <w:lang w:val="en-US"/>
         </w:rPr>
         <w:drawing>
@@ -3728,6 +3734,7 @@
         <w:rPr>
           <w:b/>
           <w:bCs/>
+          <w:noProof/>
           <w:lang w:val="en-US"/>
         </w:rPr>
         <w:drawing>
@@ -4081,6 +4088,7 @@
         <w:rPr>
           <w:b/>
           <w:bCs/>
+          <w:noProof/>
           <w:lang w:val="en-US"/>
         </w:rPr>
         <w:drawing>
@@ -4247,6 +4255,7 @@
         <w:rPr>
           <w:b/>
           <w:bCs/>
+          <w:noProof/>
           <w:lang w:val="en-US"/>
         </w:rPr>
         <w:drawing>
@@ -4366,6 +4375,7 @@
         <w:rPr>
           <w:b/>
           <w:bCs/>
+          <w:noProof/>
           <w:lang w:val="en-US"/>
         </w:rPr>
         <w:lastRenderedPageBreak/>
@@ -4762,6 +4772,7 @@
         <w:rPr>
           <w:b/>
           <w:bCs/>
+          <w:noProof/>
           <w:lang w:val="en-US"/>
         </w:rPr>
         <w:drawing>
@@ -4869,6 +4880,7 @@
         <w:rPr>
           <w:b/>
           <w:bCs/>
+          <w:noProof/>
           <w:lang w:val="en-US"/>
         </w:rPr>
         <w:drawing>
@@ -5076,6 +5088,7 @@
         <w:rPr>
           <w:b/>
           <w:bCs/>
+          <w:noProof/>
           <w:lang w:val="en-US"/>
         </w:rPr>
         <w:drawing>
@@ -6960,6 +6973,7 @@
         <w:rPr>
           <w:b/>
           <w:bCs/>
+          <w:noProof/>
           <w:lang w:val="en-US"/>
         </w:rPr>
         <w:drawing>
@@ -8879,6 +8893,7 @@
         <w:rPr>
           <w:b/>
           <w:bCs/>
+          <w:noProof/>
           <w:lang w:val="en-US"/>
         </w:rPr>
         <w:drawing>
@@ -8916,6 +8931,2210 @@
             </a:graphic>
           </wp:inline>
         </w:drawing>
+      </w:r>
+    </w:p>
+    <w:p>
+      <w:pPr>
+        <w:rPr>
+          <w:b/>
+          <w:bCs/>
+          <w:lang w:val="en-US"/>
+        </w:rPr>
+      </w:pPr>
+    </w:p>
+    <w:p>
+      <w:pPr>
+        <w:rPr>
+          <w:b/>
+          <w:bCs/>
+          <w:lang w:val="en-US"/>
+        </w:rPr>
+      </w:pPr>
+    </w:p>
+    <w:p>
+      <w:pPr>
+        <w:rPr>
+          <w:b/>
+          <w:bCs/>
+          <w:lang w:val="en-US"/>
+        </w:rPr>
+      </w:pPr>
+    </w:p>
+    <w:p>
+      <w:pPr>
+        <w:rPr>
+          <w:b/>
+          <w:bCs/>
+          <w:lang w:val="en-US"/>
+        </w:rPr>
+      </w:pPr>
+    </w:p>
+    <w:p>
+      <w:pPr>
+        <w:rPr>
+          <w:b/>
+          <w:bCs/>
+          <w:lang w:val="en-US"/>
+        </w:rPr>
+      </w:pPr>
+    </w:p>
+    <w:p>
+      <w:pPr>
+        <w:rPr>
+          <w:b/>
+          <w:bCs/>
+        </w:rPr>
+      </w:pPr>
+      <w:r>
+        <w:rPr>
+          <w:b/>
+          <w:bCs/>
+        </w:rPr>
+        <w:lastRenderedPageBreak/>
+        <w:t>Task 9:</w:t>
+      </w:r>
+    </w:p>
+    <w:p>
+      <w:pPr>
+        <w:rPr>
+          <w:b/>
+          <w:bCs/>
+        </w:rPr>
+      </w:pPr>
+    </w:p>
+    <w:p>
+      <w:pPr>
+        <w:rPr>
+          <w:b/>
+          <w:bCs/>
+        </w:rPr>
+      </w:pPr>
+      <w:r>
+        <w:rPr>
+          <w:b/>
+          <w:bCs/>
+        </w:rPr>
+        <w:t xml:space="preserve">Cli based practice </w:t>
+      </w:r>
+      <w:r>
+        <w:rPr>
+          <w:rFonts w:ascii="Segoe UI Emoji" w:hAnsi="Segoe UI Emoji" w:cs="Segoe UI Emoji"/>
+          <w:b/>
+          <w:bCs/>
+        </w:rPr>
+        <w:t>👍</w:t>
+      </w:r>
+    </w:p>
+    <w:p>
+      <w:pPr>
+        <w:rPr>
+          <w:b/>
+          <w:bCs/>
+        </w:rPr>
+      </w:pPr>
+      <w:r>
+        <w:rPr>
+          <w:b/>
+          <w:bCs/>
+        </w:rPr>
+        <w:t>Before you proceed </w:t>
+      </w:r>
+    </w:p>
+    <w:p>
+      <w:pPr>
+        <w:rPr>
+          <w:b/>
+          <w:bCs/>
+        </w:rPr>
+      </w:pPr>
+      <w:r>
+        <w:rPr>
+          <w:b/>
+          <w:bCs/>
+        </w:rPr>
+        <w:t>Aws configure </w:t>
+      </w:r>
+    </w:p>
+    <w:p>
+      <w:pPr>
+        <w:rPr>
+          <w:b/>
+          <w:bCs/>
+        </w:rPr>
+      </w:pPr>
+      <w:r>
+        <w:rPr>
+          <w:b/>
+          <w:bCs/>
+        </w:rPr>
+        <w:drawing>
+          <wp:inline distT="0" distB="0" distL="0" distR="0" wp14:anchorId="6F701E2C" wp14:editId="44512BDF">
+            <wp:extent cx="5943600" cy="3346450"/>
+            <wp:effectExtent l="0" t="0" r="0" b="6350"/>
+            <wp:docPr id="844715719" name="Picture 4"/>
+            <wp:cNvGraphicFramePr>
+              <a:graphicFrameLocks xmlns:a="http://schemas.openxmlformats.org/drawingml/2006/main" noChangeAspect="1"/>
+            </wp:cNvGraphicFramePr>
+            <a:graphic xmlns:a="http://schemas.openxmlformats.org/drawingml/2006/main">
+              <a:graphicData uri="http://schemas.openxmlformats.org/drawingml/2006/picture">
+                <pic:pic xmlns:pic="http://schemas.openxmlformats.org/drawingml/2006/picture">
+                  <pic:nvPicPr>
+                    <pic:cNvPr id="0" name="Picture 11"/>
+                    <pic:cNvPicPr>
+                      <a:picLocks noChangeAspect="1" noChangeArrowheads="1"/>
+                    </pic:cNvPicPr>
+                  </pic:nvPicPr>
+                  <pic:blipFill>
+                    <a:blip r:embed="rId20" cstate="print">
+                      <a:extLst>
+                        <a:ext uri="{28A0092B-C50C-407E-A947-70E740481C1C}">
+                          <a14:useLocalDpi xmlns:a14="http://schemas.microsoft.com/office/drawing/2010/main" val="0"/>
+                        </a:ext>
+                      </a:extLst>
+                    </a:blip>
+                    <a:srcRect/>
+                    <a:stretch>
+                      <a:fillRect/>
+                    </a:stretch>
+                  </pic:blipFill>
+                  <pic:spPr bwMode="auto">
+                    <a:xfrm>
+                      <a:off x="0" y="0"/>
+                      <a:ext cx="5943600" cy="3346450"/>
+                    </a:xfrm>
+                    <a:prstGeom prst="rect">
+                      <a:avLst/>
+                    </a:prstGeom>
+                    <a:noFill/>
+                    <a:ln>
+                      <a:noFill/>
+                    </a:ln>
+                  </pic:spPr>
+                </pic:pic>
+              </a:graphicData>
+            </a:graphic>
+          </wp:inline>
+        </w:drawing>
+      </w:r>
+    </w:p>
+    <w:p>
+      <w:pPr>
+        <w:rPr>
+          <w:b/>
+          <w:bCs/>
+        </w:rPr>
+      </w:pPr>
+    </w:p>
+    <w:p>
+      <w:pPr>
+        <w:rPr>
+          <w:b/>
+          <w:bCs/>
+        </w:rPr>
+      </w:pPr>
+      <w:r>
+        <w:rPr>
+          <w:b/>
+          <w:bCs/>
+        </w:rPr>
+        <w:t>Aws configure list</w:t>
+      </w:r>
+    </w:p>
+    <w:p>
+      <w:pPr>
+        <w:rPr>
+          <w:b/>
+          <w:bCs/>
+        </w:rPr>
+      </w:pPr>
+    </w:p>
+    <w:p>
+      <w:pPr>
+        <w:rPr>
+          <w:b/>
+          <w:bCs/>
+        </w:rPr>
+      </w:pPr>
+      <w:r>
+        <w:rPr>
+          <w:b/>
+          <w:bCs/>
+        </w:rPr>
+        <w:drawing>
+          <wp:inline distT="0" distB="0" distL="0" distR="0" wp14:anchorId="3B426742" wp14:editId="542C58A2">
+            <wp:extent cx="5943600" cy="3346450"/>
+            <wp:effectExtent l="0" t="0" r="0" b="6350"/>
+            <wp:docPr id="1849732170" name="Picture 3"/>
+            <wp:cNvGraphicFramePr>
+              <a:graphicFrameLocks xmlns:a="http://schemas.openxmlformats.org/drawingml/2006/main" noChangeAspect="1"/>
+            </wp:cNvGraphicFramePr>
+            <a:graphic xmlns:a="http://schemas.openxmlformats.org/drawingml/2006/main">
+              <a:graphicData uri="http://schemas.openxmlformats.org/drawingml/2006/picture">
+                <pic:pic xmlns:pic="http://schemas.openxmlformats.org/drawingml/2006/picture">
+                  <pic:nvPicPr>
+                    <pic:cNvPr id="0" name="Picture 12"/>
+                    <pic:cNvPicPr>
+                      <a:picLocks noChangeAspect="1" noChangeArrowheads="1"/>
+                    </pic:cNvPicPr>
+                  </pic:nvPicPr>
+                  <pic:blipFill>
+                    <a:blip r:embed="rId21" cstate="print">
+                      <a:extLst>
+                        <a:ext uri="{28A0092B-C50C-407E-A947-70E740481C1C}">
+                          <a14:useLocalDpi xmlns:a14="http://schemas.microsoft.com/office/drawing/2010/main" val="0"/>
+                        </a:ext>
+                      </a:extLst>
+                    </a:blip>
+                    <a:srcRect/>
+                    <a:stretch>
+                      <a:fillRect/>
+                    </a:stretch>
+                  </pic:blipFill>
+                  <pic:spPr bwMode="auto">
+                    <a:xfrm>
+                      <a:off x="0" y="0"/>
+                      <a:ext cx="5943600" cy="3346450"/>
+                    </a:xfrm>
+                    <a:prstGeom prst="rect">
+                      <a:avLst/>
+                    </a:prstGeom>
+                    <a:noFill/>
+                    <a:ln>
+                      <a:noFill/>
+                    </a:ln>
+                  </pic:spPr>
+                </pic:pic>
+              </a:graphicData>
+            </a:graphic>
+          </wp:inline>
+        </w:drawing>
+      </w:r>
+    </w:p>
+    <w:p>
+      <w:pPr>
+        <w:rPr>
+          <w:b/>
+          <w:bCs/>
+        </w:rPr>
+      </w:pPr>
+      <w:r>
+        <w:rPr>
+          <w:b/>
+          <w:bCs/>
+        </w:rPr>
+        <w:br/>
+      </w:r>
+    </w:p>
+    <w:p>
+      <w:pPr>
+        <w:rPr>
+          <w:b/>
+          <w:bCs/>
+        </w:rPr>
+      </w:pPr>
+      <w:r>
+        <w:rPr>
+          <w:b/>
+          <w:bCs/>
+        </w:rPr>
+        <w:t>step 1:</w:t>
+      </w:r>
+    </w:p>
+    <w:p>
+      <w:pPr>
+        <w:rPr>
+          <w:b/>
+          <w:bCs/>
+        </w:rPr>
+      </w:pPr>
+      <w:r>
+        <w:rPr>
+          <w:b/>
+          <w:bCs/>
+        </w:rPr>
+        <w:t>Check AWS Global Infrastructure</w:t>
+      </w:r>
+    </w:p>
+    <w:p>
+      <w:pPr>
+        <w:rPr>
+          <w:b/>
+          <w:bCs/>
+        </w:rPr>
+      </w:pPr>
+      <w:r>
+        <w:rPr>
+          <w:b/>
+          <w:bCs/>
+        </w:rPr>
+        <w:t>List available regions and availability zones.</w:t>
+      </w:r>
+    </w:p>
+    <w:p>
+      <w:pPr>
+        <w:rPr>
+          <w:b/>
+          <w:bCs/>
+        </w:rPr>
+      </w:pPr>
+    </w:p>
+    <w:p>
+      <w:pPr>
+        <w:rPr>
+          <w:b/>
+          <w:bCs/>
+        </w:rPr>
+      </w:pPr>
+      <w:r>
+        <w:rPr>
+          <w:b/>
+          <w:bCs/>
+        </w:rPr>
+        <w:t xml:space="preserve">Run: </w:t>
+      </w:r>
+      <w:proofErr w:type="spellStart"/>
+      <w:r>
+        <w:rPr>
+          <w:b/>
+          <w:bCs/>
+        </w:rPr>
+        <w:t>aws</w:t>
+      </w:r>
+      <w:proofErr w:type="spellEnd"/>
+      <w:r>
+        <w:rPr>
+          <w:b/>
+          <w:bCs/>
+        </w:rPr>
+        <w:t xml:space="preserve"> ec2 describe-regions --output table</w:t>
+      </w:r>
+    </w:p>
+    <w:p>
+      <w:pPr>
+        <w:rPr>
+          <w:b/>
+          <w:bCs/>
+        </w:rPr>
+      </w:pPr>
+    </w:p>
+    <w:p>
+      <w:pPr>
+        <w:rPr>
+          <w:b/>
+          <w:bCs/>
+        </w:rPr>
+      </w:pPr>
+      <w:r>
+        <w:rPr>
+          <w:b/>
+          <w:bCs/>
+        </w:rPr>
+        <w:t xml:space="preserve">Run: </w:t>
+      </w:r>
+      <w:proofErr w:type="spellStart"/>
+      <w:r>
+        <w:rPr>
+          <w:b/>
+          <w:bCs/>
+        </w:rPr>
+        <w:t>aws</w:t>
+      </w:r>
+      <w:proofErr w:type="spellEnd"/>
+      <w:r>
+        <w:rPr>
+          <w:b/>
+          <w:bCs/>
+        </w:rPr>
+        <w:t xml:space="preserve"> ec2 describe-availability-zones --region us-east-1 --output table</w:t>
+      </w:r>
+    </w:p>
+    <w:p>
+      <w:pPr>
+        <w:rPr>
+          <w:b/>
+          <w:bCs/>
+        </w:rPr>
+      </w:pPr>
+    </w:p>
+    <w:p>
+      <w:pPr>
+        <w:rPr>
+          <w:b/>
+          <w:bCs/>
+        </w:rPr>
+      </w:pPr>
+      <w:r>
+        <w:rPr>
+          <w:b/>
+          <w:bCs/>
+        </w:rPr>
+        <w:t>Confirms which regions and zones you can use.</w:t>
+      </w:r>
+    </w:p>
+    <w:p>
+      <w:pPr>
+        <w:rPr>
+          <w:b/>
+          <w:bCs/>
+        </w:rPr>
+      </w:pPr>
+    </w:p>
+    <w:p>
+      <w:pPr>
+        <w:rPr>
+          <w:b/>
+          <w:bCs/>
+        </w:rPr>
+      </w:pPr>
+      <w:r>
+        <w:rPr>
+          <w:b/>
+          <w:bCs/>
+        </w:rPr>
+        <w:t>step 2:</w:t>
+      </w:r>
+    </w:p>
+    <w:p>
+      <w:pPr>
+        <w:rPr>
+          <w:b/>
+          <w:bCs/>
+        </w:rPr>
+      </w:pPr>
+      <w:r>
+        <w:rPr>
+          <w:b/>
+          <w:bCs/>
+        </w:rPr>
+        <w:t>Identity and Access Management (IAM)</w:t>
+      </w:r>
+    </w:p>
+    <w:p>
+      <w:pPr>
+        <w:rPr>
+          <w:b/>
+          <w:bCs/>
+        </w:rPr>
+      </w:pPr>
+      <w:r>
+        <w:rPr>
+          <w:b/>
+          <w:bCs/>
+        </w:rPr>
+        <w:t>Create a new IAM user with CLI.</w:t>
+      </w:r>
+    </w:p>
+    <w:p>
+      <w:pPr>
+        <w:rPr>
+          <w:b/>
+          <w:bCs/>
+        </w:rPr>
+      </w:pPr>
+    </w:p>
+    <w:p>
+      <w:pPr>
+        <w:rPr>
+          <w:b/>
+          <w:bCs/>
+        </w:rPr>
+      </w:pPr>
+      <w:r>
+        <w:rPr>
+          <w:b/>
+          <w:bCs/>
+        </w:rPr>
+        <w:t xml:space="preserve">Run: </w:t>
+      </w:r>
+      <w:proofErr w:type="spellStart"/>
+      <w:r>
+        <w:rPr>
+          <w:b/>
+          <w:bCs/>
+        </w:rPr>
+        <w:t>aws</w:t>
+      </w:r>
+      <w:proofErr w:type="spellEnd"/>
+      <w:r>
+        <w:rPr>
+          <w:b/>
+          <w:bCs/>
+        </w:rPr>
+        <w:t xml:space="preserve"> </w:t>
+      </w:r>
+      <w:proofErr w:type="spellStart"/>
+      <w:r>
+        <w:rPr>
+          <w:b/>
+          <w:bCs/>
+        </w:rPr>
+        <w:t>iam</w:t>
+      </w:r>
+      <w:proofErr w:type="spellEnd"/>
+      <w:r>
+        <w:rPr>
+          <w:b/>
+          <w:bCs/>
+        </w:rPr>
+        <w:t xml:space="preserve"> create-user --</w:t>
+      </w:r>
+      <w:proofErr w:type="gramStart"/>
+      <w:r>
+        <w:rPr>
+          <w:b/>
+          <w:bCs/>
+        </w:rPr>
+        <w:t>user-name</w:t>
+      </w:r>
+      <w:proofErr w:type="gramEnd"/>
+      <w:r>
+        <w:rPr>
+          <w:b/>
+          <w:bCs/>
+        </w:rPr>
+        <w:t xml:space="preserve"> </w:t>
+      </w:r>
+      <w:proofErr w:type="spellStart"/>
+      <w:r>
+        <w:rPr>
+          <w:b/>
+          <w:bCs/>
+        </w:rPr>
+        <w:t>demoUser</w:t>
+      </w:r>
+      <w:proofErr w:type="spellEnd"/>
+    </w:p>
+    <w:p>
+      <w:pPr>
+        <w:rPr>
+          <w:b/>
+          <w:bCs/>
+        </w:rPr>
+      </w:pPr>
+    </w:p>
+    <w:p>
+      <w:pPr>
+        <w:rPr>
+          <w:b/>
+          <w:bCs/>
+        </w:rPr>
+      </w:pPr>
+      <w:r>
+        <w:rPr>
+          <w:b/>
+          <w:bCs/>
+        </w:rPr>
+        <w:t xml:space="preserve">Attach policy: </w:t>
+      </w:r>
+      <w:proofErr w:type="spellStart"/>
+      <w:r>
+        <w:rPr>
+          <w:b/>
+          <w:bCs/>
+        </w:rPr>
+        <w:t>aws</w:t>
+      </w:r>
+      <w:proofErr w:type="spellEnd"/>
+      <w:r>
+        <w:rPr>
+          <w:b/>
+          <w:bCs/>
+        </w:rPr>
+        <w:t xml:space="preserve"> </w:t>
+      </w:r>
+      <w:proofErr w:type="spellStart"/>
+      <w:r>
+        <w:rPr>
+          <w:b/>
+          <w:bCs/>
+        </w:rPr>
+        <w:t>iam</w:t>
+      </w:r>
+      <w:proofErr w:type="spellEnd"/>
+      <w:r>
+        <w:rPr>
+          <w:b/>
+          <w:bCs/>
+        </w:rPr>
+        <w:t xml:space="preserve"> attach-user-policy --</w:t>
+      </w:r>
+      <w:proofErr w:type="gramStart"/>
+      <w:r>
+        <w:rPr>
+          <w:b/>
+          <w:bCs/>
+        </w:rPr>
+        <w:t>user-name</w:t>
+      </w:r>
+      <w:proofErr w:type="gramEnd"/>
+      <w:r>
+        <w:rPr>
+          <w:b/>
+          <w:bCs/>
+        </w:rPr>
+        <w:t xml:space="preserve"> </w:t>
+      </w:r>
+      <w:proofErr w:type="spellStart"/>
+      <w:r>
+        <w:rPr>
+          <w:b/>
+          <w:bCs/>
+        </w:rPr>
+        <w:t>demoUser</w:t>
+      </w:r>
+      <w:proofErr w:type="spellEnd"/>
+      <w:r>
+        <w:rPr>
+          <w:b/>
+          <w:bCs/>
+        </w:rPr>
+        <w:t xml:space="preserve"> --policy-</w:t>
+      </w:r>
+      <w:proofErr w:type="spellStart"/>
+      <w:r>
+        <w:rPr>
+          <w:b/>
+          <w:bCs/>
+        </w:rPr>
+        <w:t>arn</w:t>
+      </w:r>
+      <w:proofErr w:type="spellEnd"/>
+      <w:r>
+        <w:rPr>
+          <w:b/>
+          <w:bCs/>
+        </w:rPr>
+        <w:t xml:space="preserve"> </w:t>
+      </w:r>
+      <w:proofErr w:type="spellStart"/>
+      <w:proofErr w:type="gramStart"/>
+      <w:r>
+        <w:rPr>
+          <w:b/>
+          <w:bCs/>
+        </w:rPr>
+        <w:t>arn:aws</w:t>
+      </w:r>
+      <w:proofErr w:type="gramEnd"/>
+      <w:r>
+        <w:rPr>
+          <w:b/>
+          <w:bCs/>
+        </w:rPr>
+        <w:t>:</w:t>
+      </w:r>
+      <w:proofErr w:type="gramStart"/>
+      <w:r>
+        <w:rPr>
+          <w:b/>
+          <w:bCs/>
+        </w:rPr>
+        <w:t>iam</w:t>
+      </w:r>
+      <w:proofErr w:type="spellEnd"/>
+      <w:r>
+        <w:rPr>
+          <w:b/>
+          <w:bCs/>
+        </w:rPr>
+        <w:t>::</w:t>
+      </w:r>
+      <w:proofErr w:type="spellStart"/>
+      <w:r>
+        <w:rPr>
+          <w:b/>
+          <w:bCs/>
+        </w:rPr>
+        <w:t>aws:policy</w:t>
+      </w:r>
+      <w:proofErr w:type="spellEnd"/>
+      <w:proofErr w:type="gramEnd"/>
+      <w:r>
+        <w:rPr>
+          <w:b/>
+          <w:bCs/>
+        </w:rPr>
+        <w:t>/AmazonS3ReadOnlyAccess</w:t>
+      </w:r>
+    </w:p>
+    <w:p>
+      <w:pPr>
+        <w:rPr>
+          <w:b/>
+          <w:bCs/>
+        </w:rPr>
+      </w:pPr>
+    </w:p>
+    <w:p>
+      <w:pPr>
+        <w:rPr>
+          <w:b/>
+          <w:bCs/>
+        </w:rPr>
+      </w:pPr>
+      <w:r>
+        <w:rPr>
+          <w:b/>
+          <w:bCs/>
+        </w:rPr>
+        <w:t xml:space="preserve">Create login profile: </w:t>
+      </w:r>
+      <w:proofErr w:type="spellStart"/>
+      <w:r>
+        <w:rPr>
+          <w:b/>
+          <w:bCs/>
+        </w:rPr>
+        <w:t>aws</w:t>
+      </w:r>
+      <w:proofErr w:type="spellEnd"/>
+      <w:r>
+        <w:rPr>
+          <w:b/>
+          <w:bCs/>
+        </w:rPr>
+        <w:t xml:space="preserve"> </w:t>
+      </w:r>
+      <w:proofErr w:type="spellStart"/>
+      <w:r>
+        <w:rPr>
+          <w:b/>
+          <w:bCs/>
+        </w:rPr>
+        <w:t>iam</w:t>
+      </w:r>
+      <w:proofErr w:type="spellEnd"/>
+      <w:r>
+        <w:rPr>
+          <w:b/>
+          <w:bCs/>
+        </w:rPr>
+        <w:t xml:space="preserve"> create-login-profile --</w:t>
+      </w:r>
+      <w:proofErr w:type="gramStart"/>
+      <w:r>
+        <w:rPr>
+          <w:b/>
+          <w:bCs/>
+        </w:rPr>
+        <w:t>user-name</w:t>
+      </w:r>
+      <w:proofErr w:type="gramEnd"/>
+      <w:r>
+        <w:rPr>
+          <w:b/>
+          <w:bCs/>
+        </w:rPr>
+        <w:t xml:space="preserve"> </w:t>
+      </w:r>
+      <w:proofErr w:type="spellStart"/>
+      <w:r>
+        <w:rPr>
+          <w:b/>
+          <w:bCs/>
+        </w:rPr>
+        <w:t>demoUser</w:t>
+      </w:r>
+      <w:proofErr w:type="spellEnd"/>
+      <w:r>
+        <w:rPr>
+          <w:b/>
+          <w:bCs/>
+        </w:rPr>
+        <w:t xml:space="preserve"> --password &lt;Password&gt;</w:t>
+      </w:r>
+    </w:p>
+    <w:p>
+      <w:pPr>
+        <w:rPr>
+          <w:b/>
+          <w:bCs/>
+        </w:rPr>
+      </w:pPr>
+    </w:p>
+    <w:p>
+      <w:pPr>
+        <w:rPr>
+          <w:b/>
+          <w:bCs/>
+        </w:rPr>
+      </w:pPr>
+      <w:r>
+        <w:rPr>
+          <w:b/>
+          <w:bCs/>
+        </w:rPr>
+        <w:t>step 3:</w:t>
+      </w:r>
+    </w:p>
+    <w:p>
+      <w:pPr>
+        <w:rPr>
+          <w:b/>
+          <w:bCs/>
+        </w:rPr>
+      </w:pPr>
+      <w:r>
+        <w:rPr>
+          <w:b/>
+          <w:bCs/>
+        </w:rPr>
+        <w:t>Launch EC2 Instance</w:t>
+      </w:r>
+    </w:p>
+    <w:p>
+      <w:pPr>
+        <w:rPr>
+          <w:b/>
+          <w:bCs/>
+        </w:rPr>
+      </w:pPr>
+      <w:r>
+        <w:rPr>
+          <w:b/>
+          <w:bCs/>
+        </w:rPr>
+        <w:t>Start a basic compute server.</w:t>
+      </w:r>
+    </w:p>
+    <w:p>
+      <w:pPr>
+        <w:rPr>
+          <w:b/>
+          <w:bCs/>
+        </w:rPr>
+      </w:pPr>
+    </w:p>
+    <w:p>
+      <w:pPr>
+        <w:rPr>
+          <w:b/>
+          <w:bCs/>
+        </w:rPr>
+      </w:pPr>
+      <w:r>
+        <w:rPr>
+          <w:b/>
+          <w:bCs/>
+        </w:rPr>
+        <w:t xml:space="preserve">Run: </w:t>
+      </w:r>
+      <w:proofErr w:type="spellStart"/>
+      <w:r>
+        <w:rPr>
+          <w:b/>
+          <w:bCs/>
+        </w:rPr>
+        <w:t>aws</w:t>
+      </w:r>
+      <w:proofErr w:type="spellEnd"/>
+      <w:r>
+        <w:rPr>
+          <w:b/>
+          <w:bCs/>
+        </w:rPr>
+        <w:t xml:space="preserve"> ec2 run-instances --image-id ami-0abcdef1234567890 --count 1 --instance-type t</w:t>
+      </w:r>
+      <w:proofErr w:type="gramStart"/>
+      <w:r>
+        <w:rPr>
+          <w:b/>
+          <w:bCs/>
+        </w:rPr>
+        <w:t>2.micro</w:t>
+      </w:r>
+      <w:proofErr w:type="gramEnd"/>
+      <w:r>
+        <w:rPr>
+          <w:b/>
+          <w:bCs/>
+        </w:rPr>
+        <w:t xml:space="preserve"> --key-name </w:t>
+      </w:r>
+      <w:proofErr w:type="spellStart"/>
+      <w:r>
+        <w:rPr>
+          <w:b/>
+          <w:bCs/>
+        </w:rPr>
+        <w:t>myKey</w:t>
+      </w:r>
+      <w:proofErr w:type="spellEnd"/>
+      <w:r>
+        <w:rPr>
+          <w:b/>
+          <w:bCs/>
+        </w:rPr>
+        <w:t xml:space="preserve"> --security-group-ids sg-123456 --subnet-id subnet-123456</w:t>
+      </w:r>
+    </w:p>
+    <w:p>
+      <w:pPr>
+        <w:rPr>
+          <w:b/>
+          <w:bCs/>
+        </w:rPr>
+      </w:pPr>
+    </w:p>
+    <w:p>
+      <w:pPr>
+        <w:rPr>
+          <w:b/>
+          <w:bCs/>
+        </w:rPr>
+      </w:pPr>
+      <w:r>
+        <w:rPr>
+          <w:b/>
+          <w:bCs/>
+        </w:rPr>
+        <w:t xml:space="preserve">Check status: </w:t>
+      </w:r>
+      <w:proofErr w:type="spellStart"/>
+      <w:r>
+        <w:rPr>
+          <w:b/>
+          <w:bCs/>
+        </w:rPr>
+        <w:t>aws</w:t>
+      </w:r>
+      <w:proofErr w:type="spellEnd"/>
+      <w:r>
+        <w:rPr>
+          <w:b/>
+          <w:bCs/>
+        </w:rPr>
+        <w:t xml:space="preserve"> ec2 describe-instances --instance-ids &lt;id&gt;</w:t>
+      </w:r>
+    </w:p>
+    <w:p>
+      <w:pPr>
+        <w:rPr>
+          <w:b/>
+          <w:bCs/>
+        </w:rPr>
+      </w:pPr>
+    </w:p>
+    <w:p>
+      <w:pPr>
+        <w:rPr>
+          <w:b/>
+          <w:bCs/>
+        </w:rPr>
+      </w:pPr>
+      <w:r>
+        <w:rPr>
+          <w:b/>
+          <w:bCs/>
+        </w:rPr>
+        <w:t>step 4:</w:t>
+      </w:r>
+    </w:p>
+    <w:p>
+      <w:pPr>
+        <w:rPr>
+          <w:b/>
+          <w:bCs/>
+        </w:rPr>
+      </w:pPr>
+      <w:r>
+        <w:rPr>
+          <w:b/>
+          <w:bCs/>
+        </w:rPr>
+        <w:t>S3 Storage Basics</w:t>
+      </w:r>
+    </w:p>
+    <w:p>
+      <w:pPr>
+        <w:rPr>
+          <w:b/>
+          <w:bCs/>
+        </w:rPr>
+      </w:pPr>
+      <w:r>
+        <w:rPr>
+          <w:b/>
+          <w:bCs/>
+        </w:rPr>
+        <w:t>Create a bucket and upload a file.</w:t>
+      </w:r>
+    </w:p>
+    <w:p>
+      <w:pPr>
+        <w:rPr>
+          <w:b/>
+          <w:bCs/>
+        </w:rPr>
+      </w:pPr>
+    </w:p>
+    <w:p>
+      <w:pPr>
+        <w:rPr>
+          <w:b/>
+          <w:bCs/>
+        </w:rPr>
+      </w:pPr>
+      <w:r>
+        <w:rPr>
+          <w:b/>
+          <w:bCs/>
+        </w:rPr>
+        <w:t xml:space="preserve">Run: </w:t>
+      </w:r>
+      <w:proofErr w:type="spellStart"/>
+      <w:r>
+        <w:rPr>
+          <w:b/>
+          <w:bCs/>
+        </w:rPr>
+        <w:t>aws</w:t>
+      </w:r>
+      <w:proofErr w:type="spellEnd"/>
+      <w:r>
+        <w:rPr>
+          <w:b/>
+          <w:bCs/>
+        </w:rPr>
+        <w:t xml:space="preserve"> s3 mb s3://mybucket-demo</w:t>
+      </w:r>
+    </w:p>
+    <w:p>
+      <w:pPr>
+        <w:rPr>
+          <w:b/>
+          <w:bCs/>
+        </w:rPr>
+      </w:pPr>
+    </w:p>
+    <w:p>
+      <w:pPr>
+        <w:rPr>
+          <w:b/>
+          <w:bCs/>
+        </w:rPr>
+      </w:pPr>
+      <w:r>
+        <w:rPr>
+          <w:b/>
+          <w:bCs/>
+        </w:rPr>
+        <w:t xml:space="preserve">Upload: </w:t>
+      </w:r>
+      <w:proofErr w:type="spellStart"/>
+      <w:r>
+        <w:rPr>
+          <w:b/>
+          <w:bCs/>
+        </w:rPr>
+        <w:t>aws</w:t>
+      </w:r>
+      <w:proofErr w:type="spellEnd"/>
+      <w:r>
+        <w:rPr>
+          <w:b/>
+          <w:bCs/>
+        </w:rPr>
+        <w:t xml:space="preserve"> s3 cp demo.txt s3://mybucket-demo/</w:t>
+      </w:r>
+    </w:p>
+    <w:p>
+      <w:pPr>
+        <w:rPr>
+          <w:b/>
+          <w:bCs/>
+        </w:rPr>
+      </w:pPr>
+    </w:p>
+    <w:p>
+      <w:pPr>
+        <w:rPr>
+          <w:b/>
+          <w:bCs/>
+        </w:rPr>
+      </w:pPr>
+      <w:r>
+        <w:rPr>
+          <w:b/>
+          <w:bCs/>
+        </w:rPr>
+        <w:t xml:space="preserve">List: </w:t>
+      </w:r>
+      <w:proofErr w:type="spellStart"/>
+      <w:r>
+        <w:rPr>
+          <w:b/>
+          <w:bCs/>
+        </w:rPr>
+        <w:t>aws</w:t>
+      </w:r>
+      <w:proofErr w:type="spellEnd"/>
+      <w:r>
+        <w:rPr>
+          <w:b/>
+          <w:bCs/>
+        </w:rPr>
+        <w:t xml:space="preserve"> s3 ls s3://mybucket-demo/</w:t>
+      </w:r>
+    </w:p>
+    <w:p>
+      <w:pPr>
+        <w:rPr>
+          <w:b/>
+          <w:bCs/>
+        </w:rPr>
+      </w:pPr>
+    </w:p>
+    <w:p>
+      <w:pPr>
+        <w:rPr>
+          <w:b/>
+          <w:bCs/>
+        </w:rPr>
+      </w:pPr>
+      <w:r>
+        <w:rPr>
+          <w:b/>
+          <w:bCs/>
+        </w:rPr>
+        <w:t>step 5:</w:t>
+      </w:r>
+    </w:p>
+    <w:p>
+      <w:pPr>
+        <w:rPr>
+          <w:b/>
+          <w:bCs/>
+        </w:rPr>
+      </w:pPr>
+      <w:r>
+        <w:rPr>
+          <w:b/>
+          <w:bCs/>
+        </w:rPr>
+        <w:t>VPC Networking Basics</w:t>
+      </w:r>
+    </w:p>
+    <w:p>
+      <w:pPr>
+        <w:rPr>
+          <w:b/>
+          <w:bCs/>
+        </w:rPr>
+      </w:pPr>
+      <w:r>
+        <w:rPr>
+          <w:b/>
+          <w:bCs/>
+        </w:rPr>
+        <w:t>Create a simple VPC with subnets.</w:t>
+      </w:r>
+    </w:p>
+    <w:p>
+      <w:pPr>
+        <w:rPr>
+          <w:b/>
+          <w:bCs/>
+        </w:rPr>
+      </w:pPr>
+    </w:p>
+    <w:p>
+      <w:pPr>
+        <w:rPr>
+          <w:b/>
+          <w:bCs/>
+        </w:rPr>
+      </w:pPr>
+      <w:r>
+        <w:rPr>
+          <w:b/>
+          <w:bCs/>
+        </w:rPr>
+        <w:t xml:space="preserve">Run: </w:t>
+      </w:r>
+      <w:proofErr w:type="spellStart"/>
+      <w:r>
+        <w:rPr>
+          <w:b/>
+          <w:bCs/>
+        </w:rPr>
+        <w:t>aws</w:t>
+      </w:r>
+      <w:proofErr w:type="spellEnd"/>
+      <w:r>
+        <w:rPr>
+          <w:b/>
+          <w:bCs/>
+        </w:rPr>
+        <w:t xml:space="preserve"> ec2 create-</w:t>
+      </w:r>
+      <w:proofErr w:type="spellStart"/>
+      <w:r>
+        <w:rPr>
+          <w:b/>
+          <w:bCs/>
+        </w:rPr>
+        <w:t>vpc</w:t>
+      </w:r>
+      <w:proofErr w:type="spellEnd"/>
+      <w:r>
+        <w:rPr>
+          <w:b/>
+          <w:bCs/>
+        </w:rPr>
+        <w:t xml:space="preserve"> --</w:t>
+      </w:r>
+      <w:proofErr w:type="spellStart"/>
+      <w:r>
+        <w:rPr>
+          <w:b/>
+          <w:bCs/>
+        </w:rPr>
+        <w:t>cidr</w:t>
+      </w:r>
+      <w:proofErr w:type="spellEnd"/>
+      <w:r>
+        <w:rPr>
+          <w:b/>
+          <w:bCs/>
+        </w:rPr>
+        <w:t>-block 10.0.0.0/16</w:t>
+      </w:r>
+    </w:p>
+    <w:p>
+      <w:pPr>
+        <w:rPr>
+          <w:b/>
+          <w:bCs/>
+        </w:rPr>
+      </w:pPr>
+    </w:p>
+    <w:p>
+      <w:pPr>
+        <w:rPr>
+          <w:b/>
+          <w:bCs/>
+        </w:rPr>
+      </w:pPr>
+      <w:r>
+        <w:rPr>
+          <w:b/>
+          <w:bCs/>
+        </w:rPr>
+        <w:t xml:space="preserve">Create subnet: </w:t>
+      </w:r>
+      <w:proofErr w:type="spellStart"/>
+      <w:r>
+        <w:rPr>
+          <w:b/>
+          <w:bCs/>
+        </w:rPr>
+        <w:t>aws</w:t>
+      </w:r>
+      <w:proofErr w:type="spellEnd"/>
+      <w:r>
+        <w:rPr>
+          <w:b/>
+          <w:bCs/>
+        </w:rPr>
+        <w:t xml:space="preserve"> ec2 create-subnet --</w:t>
+      </w:r>
+      <w:proofErr w:type="spellStart"/>
+      <w:r>
+        <w:rPr>
+          <w:b/>
+          <w:bCs/>
+        </w:rPr>
+        <w:t>vpc</w:t>
+      </w:r>
+      <w:proofErr w:type="spellEnd"/>
+      <w:r>
+        <w:rPr>
+          <w:b/>
+          <w:bCs/>
+        </w:rPr>
+        <w:t>-id &lt;</w:t>
+      </w:r>
+      <w:proofErr w:type="spellStart"/>
+      <w:r>
+        <w:rPr>
+          <w:b/>
+          <w:bCs/>
+        </w:rPr>
+        <w:t>vpc</w:t>
+      </w:r>
+      <w:proofErr w:type="spellEnd"/>
+      <w:r>
+        <w:rPr>
+          <w:b/>
+          <w:bCs/>
+        </w:rPr>
+        <w:t>-id&gt; --</w:t>
+      </w:r>
+      <w:proofErr w:type="spellStart"/>
+      <w:r>
+        <w:rPr>
+          <w:b/>
+          <w:bCs/>
+        </w:rPr>
+        <w:t>cidr</w:t>
+      </w:r>
+      <w:proofErr w:type="spellEnd"/>
+      <w:r>
+        <w:rPr>
+          <w:b/>
+          <w:bCs/>
+        </w:rPr>
+        <w:t>-block 10.0.1.0/24</w:t>
+      </w:r>
+    </w:p>
+    <w:p>
+      <w:pPr>
+        <w:rPr>
+          <w:b/>
+          <w:bCs/>
+        </w:rPr>
+      </w:pPr>
+    </w:p>
+    <w:p>
+      <w:pPr>
+        <w:rPr>
+          <w:b/>
+          <w:bCs/>
+        </w:rPr>
+      </w:pPr>
+      <w:r>
+        <w:rPr>
+          <w:b/>
+          <w:bCs/>
+        </w:rPr>
+        <w:t xml:space="preserve">Create IGW: </w:t>
+      </w:r>
+      <w:proofErr w:type="spellStart"/>
+      <w:r>
+        <w:rPr>
+          <w:b/>
+          <w:bCs/>
+        </w:rPr>
+        <w:t>aws</w:t>
+      </w:r>
+      <w:proofErr w:type="spellEnd"/>
+      <w:r>
+        <w:rPr>
+          <w:b/>
+          <w:bCs/>
+        </w:rPr>
+        <w:t xml:space="preserve"> ec2 create-internet-gateway</w:t>
+      </w:r>
+    </w:p>
+    <w:p>
+      <w:pPr>
+        <w:rPr>
+          <w:b/>
+          <w:bCs/>
+        </w:rPr>
+      </w:pPr>
+    </w:p>
+    <w:p>
+      <w:pPr>
+        <w:rPr>
+          <w:b/>
+          <w:bCs/>
+        </w:rPr>
+      </w:pPr>
+      <w:r>
+        <w:rPr>
+          <w:b/>
+          <w:bCs/>
+        </w:rPr>
+        <w:t xml:space="preserve">Attach IGW: </w:t>
+      </w:r>
+      <w:proofErr w:type="spellStart"/>
+      <w:r>
+        <w:rPr>
+          <w:b/>
+          <w:bCs/>
+        </w:rPr>
+        <w:t>aws</w:t>
+      </w:r>
+      <w:proofErr w:type="spellEnd"/>
+      <w:r>
+        <w:rPr>
+          <w:b/>
+          <w:bCs/>
+        </w:rPr>
+        <w:t xml:space="preserve"> ec2 attach-internet-gateway --</w:t>
+      </w:r>
+      <w:proofErr w:type="spellStart"/>
+      <w:r>
+        <w:rPr>
+          <w:b/>
+          <w:bCs/>
+        </w:rPr>
+        <w:t>vpc</w:t>
+      </w:r>
+      <w:proofErr w:type="spellEnd"/>
+      <w:r>
+        <w:rPr>
+          <w:b/>
+          <w:bCs/>
+        </w:rPr>
+        <w:t>-id &lt;</w:t>
+      </w:r>
+      <w:proofErr w:type="spellStart"/>
+      <w:r>
+        <w:rPr>
+          <w:b/>
+          <w:bCs/>
+        </w:rPr>
+        <w:t>vpc</w:t>
+      </w:r>
+      <w:proofErr w:type="spellEnd"/>
+      <w:r>
+        <w:rPr>
+          <w:b/>
+          <w:bCs/>
+        </w:rPr>
+        <w:t>-id&gt; --internet-gateway-id &lt;</w:t>
+      </w:r>
+      <w:proofErr w:type="spellStart"/>
+      <w:r>
+        <w:rPr>
+          <w:b/>
+          <w:bCs/>
+        </w:rPr>
+        <w:t>igw</w:t>
+      </w:r>
+      <w:proofErr w:type="spellEnd"/>
+      <w:r>
+        <w:rPr>
+          <w:b/>
+          <w:bCs/>
+        </w:rPr>
+        <w:t>-id&gt;</w:t>
+      </w:r>
+    </w:p>
+    <w:p>
+      <w:pPr>
+        <w:rPr>
+          <w:b/>
+          <w:bCs/>
+        </w:rPr>
+      </w:pPr>
+    </w:p>
+    <w:p>
+      <w:pPr>
+        <w:rPr>
+          <w:b/>
+          <w:bCs/>
+        </w:rPr>
+      </w:pPr>
+      <w:r>
+        <w:rPr>
+          <w:b/>
+          <w:bCs/>
+        </w:rPr>
+        <w:t>step 6:</w:t>
+      </w:r>
+    </w:p>
+    <w:p>
+      <w:pPr>
+        <w:rPr>
+          <w:b/>
+          <w:bCs/>
+        </w:rPr>
+      </w:pPr>
+      <w:r>
+        <w:rPr>
+          <w:b/>
+          <w:bCs/>
+        </w:rPr>
+        <w:t>RDS Managed Database</w:t>
+      </w:r>
+    </w:p>
+    <w:p>
+      <w:pPr>
+        <w:rPr>
+          <w:b/>
+          <w:bCs/>
+        </w:rPr>
+      </w:pPr>
+      <w:r>
+        <w:rPr>
+          <w:b/>
+          <w:bCs/>
+        </w:rPr>
+        <w:t>Launch a MySQL RDS instance.</w:t>
+      </w:r>
+    </w:p>
+    <w:p>
+      <w:pPr>
+        <w:rPr>
+          <w:b/>
+          <w:bCs/>
+        </w:rPr>
+      </w:pPr>
+    </w:p>
+    <w:p>
+      <w:pPr>
+        <w:rPr>
+          <w:b/>
+          <w:bCs/>
+        </w:rPr>
+      </w:pPr>
+      <w:r>
+        <w:rPr>
+          <w:b/>
+          <w:bCs/>
+        </w:rPr>
+        <w:t xml:space="preserve">Run: </w:t>
+      </w:r>
+      <w:proofErr w:type="spellStart"/>
+      <w:r>
+        <w:rPr>
+          <w:b/>
+          <w:bCs/>
+        </w:rPr>
+        <w:t>aws</w:t>
+      </w:r>
+      <w:proofErr w:type="spellEnd"/>
+      <w:r>
+        <w:rPr>
+          <w:b/>
+          <w:bCs/>
+        </w:rPr>
+        <w:t xml:space="preserve"> </w:t>
+      </w:r>
+      <w:proofErr w:type="spellStart"/>
+      <w:r>
+        <w:rPr>
+          <w:b/>
+          <w:bCs/>
+        </w:rPr>
+        <w:t>rds</w:t>
+      </w:r>
+      <w:proofErr w:type="spellEnd"/>
+      <w:r>
+        <w:rPr>
+          <w:b/>
+          <w:bCs/>
+        </w:rPr>
+        <w:t xml:space="preserve"> create-</w:t>
+      </w:r>
+      <w:proofErr w:type="spellStart"/>
+      <w:r>
+        <w:rPr>
+          <w:b/>
+          <w:bCs/>
+        </w:rPr>
+        <w:t>db</w:t>
+      </w:r>
+      <w:proofErr w:type="spellEnd"/>
+      <w:r>
+        <w:rPr>
+          <w:b/>
+          <w:bCs/>
+        </w:rPr>
+        <w:t>-instance --</w:t>
+      </w:r>
+      <w:proofErr w:type="spellStart"/>
+      <w:r>
+        <w:rPr>
+          <w:b/>
+          <w:bCs/>
+        </w:rPr>
+        <w:t>db</w:t>
+      </w:r>
+      <w:proofErr w:type="spellEnd"/>
+      <w:r>
+        <w:rPr>
+          <w:b/>
+          <w:bCs/>
+        </w:rPr>
+        <w:t xml:space="preserve">-instance-identifier </w:t>
+      </w:r>
+      <w:proofErr w:type="spellStart"/>
+      <w:r>
+        <w:rPr>
+          <w:b/>
+          <w:bCs/>
+        </w:rPr>
+        <w:t>mydb</w:t>
+      </w:r>
+      <w:proofErr w:type="spellEnd"/>
+      <w:r>
+        <w:rPr>
+          <w:b/>
+          <w:bCs/>
+        </w:rPr>
+        <w:t xml:space="preserve"> --</w:t>
+      </w:r>
+      <w:proofErr w:type="spellStart"/>
+      <w:r>
+        <w:rPr>
+          <w:b/>
+          <w:bCs/>
+        </w:rPr>
+        <w:t>db</w:t>
+      </w:r>
+      <w:proofErr w:type="spellEnd"/>
+      <w:r>
+        <w:rPr>
+          <w:b/>
+          <w:bCs/>
+        </w:rPr>
+        <w:t>-instance-class db.t</w:t>
+      </w:r>
+      <w:proofErr w:type="gramStart"/>
+      <w:r>
+        <w:rPr>
+          <w:b/>
+          <w:bCs/>
+        </w:rPr>
+        <w:t>2.micro</w:t>
+      </w:r>
+      <w:proofErr w:type="gramEnd"/>
+      <w:r>
+        <w:rPr>
+          <w:b/>
+          <w:bCs/>
+        </w:rPr>
+        <w:t xml:space="preserve"> --engine </w:t>
+      </w:r>
+      <w:proofErr w:type="spellStart"/>
+      <w:r>
+        <w:rPr>
+          <w:b/>
+          <w:bCs/>
+        </w:rPr>
+        <w:t>mysql</w:t>
+      </w:r>
+      <w:proofErr w:type="spellEnd"/>
+      <w:r>
+        <w:rPr>
+          <w:b/>
+          <w:bCs/>
+        </w:rPr>
+        <w:t xml:space="preserve"> --master-username admin --master-user-password &lt;Password&gt; --allocated-storage 20</w:t>
+      </w:r>
+    </w:p>
+    <w:p>
+      <w:pPr>
+        <w:rPr>
+          <w:b/>
+          <w:bCs/>
+        </w:rPr>
+      </w:pPr>
+    </w:p>
+    <w:p>
+      <w:pPr>
+        <w:rPr>
+          <w:b/>
+          <w:bCs/>
+        </w:rPr>
+      </w:pPr>
+      <w:r>
+        <w:rPr>
+          <w:b/>
+          <w:bCs/>
+        </w:rPr>
+        <w:lastRenderedPageBreak/>
+        <w:t xml:space="preserve">Check status: </w:t>
+      </w:r>
+      <w:proofErr w:type="spellStart"/>
+      <w:r>
+        <w:rPr>
+          <w:b/>
+          <w:bCs/>
+        </w:rPr>
+        <w:t>aws</w:t>
+      </w:r>
+      <w:proofErr w:type="spellEnd"/>
+      <w:r>
+        <w:rPr>
+          <w:b/>
+          <w:bCs/>
+        </w:rPr>
+        <w:t xml:space="preserve"> </w:t>
+      </w:r>
+      <w:proofErr w:type="spellStart"/>
+      <w:r>
+        <w:rPr>
+          <w:b/>
+          <w:bCs/>
+        </w:rPr>
+        <w:t>rds</w:t>
+      </w:r>
+      <w:proofErr w:type="spellEnd"/>
+      <w:r>
+        <w:rPr>
+          <w:b/>
+          <w:bCs/>
+        </w:rPr>
+        <w:t xml:space="preserve"> describe-</w:t>
+      </w:r>
+      <w:proofErr w:type="spellStart"/>
+      <w:r>
+        <w:rPr>
+          <w:b/>
+          <w:bCs/>
+        </w:rPr>
+        <w:t>db</w:t>
+      </w:r>
+      <w:proofErr w:type="spellEnd"/>
+      <w:r>
+        <w:rPr>
+          <w:b/>
+          <w:bCs/>
+        </w:rPr>
+        <w:t>-instances --</w:t>
+      </w:r>
+      <w:proofErr w:type="spellStart"/>
+      <w:r>
+        <w:rPr>
+          <w:b/>
+          <w:bCs/>
+        </w:rPr>
+        <w:t>db</w:t>
+      </w:r>
+      <w:proofErr w:type="spellEnd"/>
+      <w:r>
+        <w:rPr>
+          <w:b/>
+          <w:bCs/>
+        </w:rPr>
+        <w:t xml:space="preserve">-instance-identifier </w:t>
+      </w:r>
+      <w:proofErr w:type="spellStart"/>
+      <w:r>
+        <w:rPr>
+          <w:b/>
+          <w:bCs/>
+        </w:rPr>
+        <w:t>mydb</w:t>
+      </w:r>
+      <w:proofErr w:type="spellEnd"/>
+    </w:p>
+    <w:p>
+      <w:pPr>
+        <w:rPr>
+          <w:b/>
+          <w:bCs/>
+        </w:rPr>
+      </w:pPr>
+    </w:p>
+    <w:p>
+      <w:pPr>
+        <w:rPr>
+          <w:b/>
+          <w:bCs/>
+        </w:rPr>
+      </w:pPr>
+      <w:r>
+        <w:rPr>
+          <w:b/>
+          <w:bCs/>
+        </w:rPr>
+        <w:t>step 7:</w:t>
+      </w:r>
+    </w:p>
+    <w:p>
+      <w:pPr>
+        <w:rPr>
+          <w:b/>
+          <w:bCs/>
+        </w:rPr>
+      </w:pPr>
+      <w:r>
+        <w:rPr>
+          <w:b/>
+          <w:bCs/>
+        </w:rPr>
+        <w:t>Security Groups Basics</w:t>
+      </w:r>
+    </w:p>
+    <w:p>
+      <w:pPr>
+        <w:rPr>
+          <w:b/>
+          <w:bCs/>
+        </w:rPr>
+      </w:pPr>
+      <w:r>
+        <w:rPr>
+          <w:b/>
+          <w:bCs/>
+        </w:rPr>
+        <w:t>Configure inbound rules for EC2.</w:t>
+      </w:r>
+    </w:p>
+    <w:p>
+      <w:pPr>
+        <w:rPr>
+          <w:b/>
+          <w:bCs/>
+        </w:rPr>
+      </w:pPr>
+    </w:p>
+    <w:p>
+      <w:pPr>
+        <w:rPr>
+          <w:b/>
+          <w:bCs/>
+        </w:rPr>
+      </w:pPr>
+      <w:r>
+        <w:rPr>
+          <w:b/>
+          <w:bCs/>
+        </w:rPr>
+        <w:t xml:space="preserve">Run: </w:t>
+      </w:r>
+      <w:proofErr w:type="spellStart"/>
+      <w:r>
+        <w:rPr>
+          <w:b/>
+          <w:bCs/>
+        </w:rPr>
+        <w:t>aws</w:t>
+      </w:r>
+      <w:proofErr w:type="spellEnd"/>
+      <w:r>
+        <w:rPr>
+          <w:b/>
+          <w:bCs/>
+        </w:rPr>
+        <w:t xml:space="preserve"> ec2 create-security-group --group-name </w:t>
+      </w:r>
+      <w:proofErr w:type="spellStart"/>
+      <w:r>
+        <w:rPr>
+          <w:b/>
+          <w:bCs/>
+        </w:rPr>
+        <w:t>demoSG</w:t>
+      </w:r>
+      <w:proofErr w:type="spellEnd"/>
+      <w:r>
+        <w:rPr>
+          <w:b/>
+          <w:bCs/>
+        </w:rPr>
+        <w:t xml:space="preserve"> --description "Demo SG" --</w:t>
+      </w:r>
+      <w:proofErr w:type="spellStart"/>
+      <w:r>
+        <w:rPr>
+          <w:b/>
+          <w:bCs/>
+        </w:rPr>
+        <w:t>vpc</w:t>
+      </w:r>
+      <w:proofErr w:type="spellEnd"/>
+      <w:r>
+        <w:rPr>
+          <w:b/>
+          <w:bCs/>
+        </w:rPr>
+        <w:t>-id &lt;</w:t>
+      </w:r>
+      <w:proofErr w:type="spellStart"/>
+      <w:r>
+        <w:rPr>
+          <w:b/>
+          <w:bCs/>
+        </w:rPr>
+        <w:t>vpc</w:t>
+      </w:r>
+      <w:proofErr w:type="spellEnd"/>
+      <w:r>
+        <w:rPr>
+          <w:b/>
+          <w:bCs/>
+        </w:rPr>
+        <w:t>-id&gt;</w:t>
+      </w:r>
+    </w:p>
+    <w:p>
+      <w:pPr>
+        <w:rPr>
+          <w:b/>
+          <w:bCs/>
+        </w:rPr>
+      </w:pPr>
+    </w:p>
+    <w:p>
+      <w:pPr>
+        <w:rPr>
+          <w:b/>
+          <w:bCs/>
+        </w:rPr>
+      </w:pPr>
+      <w:r>
+        <w:rPr>
+          <w:b/>
+          <w:bCs/>
+        </w:rPr>
+        <w:t xml:space="preserve">Add rule: </w:t>
+      </w:r>
+      <w:proofErr w:type="spellStart"/>
+      <w:r>
+        <w:rPr>
+          <w:b/>
+          <w:bCs/>
+        </w:rPr>
+        <w:t>aws</w:t>
+      </w:r>
+      <w:proofErr w:type="spellEnd"/>
+      <w:r>
+        <w:rPr>
+          <w:b/>
+          <w:bCs/>
+        </w:rPr>
+        <w:t xml:space="preserve"> ec2 authorize-security-group-ingress --group-id &lt;sg-id&gt; --protocol </w:t>
+      </w:r>
+      <w:proofErr w:type="spellStart"/>
+      <w:r>
+        <w:rPr>
+          <w:b/>
+          <w:bCs/>
+        </w:rPr>
+        <w:t>tcp</w:t>
+      </w:r>
+      <w:proofErr w:type="spellEnd"/>
+      <w:r>
+        <w:rPr>
+          <w:b/>
+          <w:bCs/>
+        </w:rPr>
+        <w:t xml:space="preserve"> --port 22 --</w:t>
+      </w:r>
+      <w:proofErr w:type="spellStart"/>
+      <w:r>
+        <w:rPr>
+          <w:b/>
+          <w:bCs/>
+        </w:rPr>
+        <w:t>cidr</w:t>
+      </w:r>
+      <w:proofErr w:type="spellEnd"/>
+      <w:r>
+        <w:rPr>
+          <w:b/>
+          <w:bCs/>
+        </w:rPr>
+        <w:t xml:space="preserve"> &lt;your-</w:t>
+      </w:r>
+      <w:proofErr w:type="spellStart"/>
+      <w:r>
+        <w:rPr>
+          <w:b/>
+          <w:bCs/>
+        </w:rPr>
+        <w:t>ip</w:t>
+      </w:r>
+      <w:proofErr w:type="spellEnd"/>
+      <w:r>
+        <w:rPr>
+          <w:b/>
+          <w:bCs/>
+        </w:rPr>
+        <w:t>&gt;/32</w:t>
+      </w:r>
+    </w:p>
+    <w:p>
+      <w:pPr>
+        <w:rPr>
+          <w:b/>
+          <w:bCs/>
+        </w:rPr>
+      </w:pPr>
+      <w:r>
+        <w:rPr>
+          <w:b/>
+          <w:bCs/>
+        </w:rPr>
+        <w:t xml:space="preserve">Verify: </w:t>
+      </w:r>
+      <w:proofErr w:type="spellStart"/>
+      <w:r>
+        <w:rPr>
+          <w:b/>
+          <w:bCs/>
+        </w:rPr>
+        <w:t>aws</w:t>
+      </w:r>
+      <w:proofErr w:type="spellEnd"/>
+      <w:r>
+        <w:rPr>
+          <w:b/>
+          <w:bCs/>
+        </w:rPr>
+        <w:t xml:space="preserve"> ec2 describe-security-groups --group-ids &lt;sg-id&gt;</w:t>
+      </w:r>
+    </w:p>
+    <w:p>
+      <w:pPr>
+        <w:rPr>
+          <w:b/>
+          <w:bCs/>
+        </w:rPr>
+      </w:pPr>
+      <w:r>
+        <w:rPr>
+          <w:b/>
+          <w:bCs/>
+        </w:rPr>
+        <w:t>—-----------------------------------------------------------------------------------------------------------------------------------------------------------------------------------------------------------------</w:t>
+      </w:r>
+    </w:p>
+    <w:p>
+      <w:pPr>
+        <w:rPr>
+          <w:b/>
+          <w:bCs/>
+        </w:rPr>
+      </w:pPr>
+    </w:p>
+    <w:p>
+      <w:pPr>
+        <w:rPr>
+          <w:b/>
+          <w:bCs/>
+        </w:rPr>
+      </w:pPr>
+      <w:r>
+        <w:rPr>
+          <w:b/>
+          <w:bCs/>
+        </w:rPr>
+        <w:t>Creating access key:</w:t>
+      </w:r>
+    </w:p>
+    <w:p>
+      <w:pPr>
+        <w:rPr>
+          <w:b/>
+          <w:bCs/>
+        </w:rPr>
+      </w:pPr>
+    </w:p>
+    <w:p>
+      <w:pPr>
+        <w:rPr>
+          <w:b/>
+          <w:bCs/>
+        </w:rPr>
+      </w:pPr>
+      <w:r>
+        <w:rPr>
+          <w:b/>
+          <w:bCs/>
+        </w:rPr>
+        <w:t>IN AWS CONSOLE</w:t>
+      </w:r>
+    </w:p>
+    <w:p>
+      <w:pPr>
+        <w:rPr>
+          <w:b/>
+          <w:bCs/>
+        </w:rPr>
+      </w:pPr>
+      <w:r>
+        <w:rPr>
+          <w:b/>
+          <w:bCs/>
+        </w:rPr>
+        <w:t>Go to IAM → Users → [Your IAM user] → Security credentials.</w:t>
+      </w:r>
+    </w:p>
+    <w:p>
+      <w:pPr>
+        <w:rPr>
+          <w:b/>
+          <w:bCs/>
+        </w:rPr>
+      </w:pPr>
+    </w:p>
+    <w:p>
+      <w:pPr>
+        <w:rPr>
+          <w:b/>
+          <w:bCs/>
+        </w:rPr>
+      </w:pPr>
+    </w:p>
+    <w:p>
+      <w:pPr>
+        <w:rPr>
+          <w:b/>
+          <w:bCs/>
+        </w:rPr>
+      </w:pPr>
+      <w:r>
+        <w:rPr>
+          <w:b/>
+          <w:bCs/>
+        </w:rPr>
+        <w:drawing>
+          <wp:inline distT="0" distB="0" distL="0" distR="0" wp14:anchorId="373D56D3" wp14:editId="797D3A23">
+            <wp:extent cx="6840220" cy="3686810"/>
+            <wp:effectExtent l="0" t="0" r="0" b="8890"/>
+            <wp:docPr id="58959074" name="Picture 1"/>
+            <wp:cNvGraphicFramePr>
+              <a:graphicFrameLocks xmlns:a="http://schemas.openxmlformats.org/drawingml/2006/main" noChangeAspect="1"/>
+            </wp:cNvGraphicFramePr>
+            <a:graphic xmlns:a="http://schemas.openxmlformats.org/drawingml/2006/main">
+              <a:graphicData uri="http://schemas.openxmlformats.org/drawingml/2006/picture">
+                <pic:pic xmlns:pic="http://schemas.openxmlformats.org/drawingml/2006/picture">
+                  <pic:nvPicPr>
+                    <pic:cNvPr id="58959074" name=""/>
+                    <pic:cNvPicPr/>
+                  </pic:nvPicPr>
+                  <pic:blipFill>
+                    <a:blip r:embed="rId22"/>
+                    <a:stretch>
+                      <a:fillRect/>
+                    </a:stretch>
+                  </pic:blipFill>
+                  <pic:spPr>
+                    <a:xfrm>
+                      <a:off x="0" y="0"/>
+                      <a:ext cx="6840220" cy="3686810"/>
+                    </a:xfrm>
+                    <a:prstGeom prst="rect">
+                      <a:avLst/>
+                    </a:prstGeom>
+                  </pic:spPr>
+                </pic:pic>
+              </a:graphicData>
+            </a:graphic>
+          </wp:inline>
+        </w:drawing>
+      </w:r>
+    </w:p>
+    <w:p>
+      <w:pPr>
+        <w:rPr>
+          <w:b/>
+          <w:bCs/>
+          <w:lang w:val="en-US"/>
+        </w:rPr>
+      </w:pPr>
+      <w:r>
+        <w:rPr>
+          <w:b/>
+          <w:bCs/>
+        </w:rPr>
+        <w:br/>
+      </w:r>
+      <w:r>
+        <w:rPr>
+          <w:b/>
+          <w:bCs/>
+        </w:rPr>
+        <w:br/>
       </w:r>
     </w:p>
     <w:sectPr>

</xml_diff>